<commit_message>
Chinese manuscript and SI (translation), final English builds
Co-Authored-By: Claude Fable 5.1 <noreply@anthropic.com>
Claude-Session: https://claude.ai/code/session_0183zpqz2vfd7Wv1Vqy6U3YS
</commit_message>
<xml_diff>
--- a/paper/Supplementary_Information_EN.docx
+++ b/paper/Supplementary_Information_EN.docx
@@ -15435,11 +15435,7 @@
           <w:p>
             <w:pPr>
               <w:pStyle w:val="Compact"/>
-              <w:jc w:val="left"/>
-            </w:pPr>
-            <w:r>
-              <w:t xml:space="preserve">+nan</w:t>
-            </w:r>
+            </w:pPr>
           </w:p>
         </w:tc>
         <w:tc>

</xml_diff>